<commit_message>
Drop the funding declaration and the research-programme section
</commit_message>
<xml_diff>
--- a/manuscript/Paper2_Babalola.docx
+++ b/manuscript/Paper2_Babalola.docx
@@ -3380,28 +3380,6 @@
       </w:r>
       <w:r>
         <w:t xml:space="preserve">Complete, seeded reproduction code in Python at https://github.com/tosin-babs/nigeria-health-protection-gap; see the repository README for the script order and environment. The full pipeline runs end to end from the raw survey files in about eight minutes.</w:t>
-      </w:r>
-    </w:p>
-    <w:p>
-      <w:pPr>
-        <w:pStyle w:val="BodyText"/>
-      </w:pPr>
-      <w:r>
-        <w:rPr>
-          <w:b/>
-          <w:bCs/>
-        </w:rPr>
-        <w:t xml:space="preserve">Funding.</w:t>
-      </w:r>
-      <w:r>
-        <w:t xml:space="preserve"> </w:t>
-      </w:r>
-      <w:r>
-        <w:rPr>
-          <w:i/>
-          <w:iCs/>
-        </w:rPr>
-        <w:t xml:space="preserve">[to be completed]</w:t>
       </w:r>
     </w:p>
     <w:p>

</xml_diff>

<commit_message>
Add word, figure and table counts to the manuscript header; rebuild DOCX and PDF
</commit_message>
<xml_diff>
--- a/manuscript/Paper2_Babalola.docx
+++ b/manuscript/Paper2_Babalola.docx
@@ -42,6 +42,56 @@
       </w:pPr>
       <w:r>
         <w:t xml:space="preserve">¹ Department of Actuarial Science and Quantitative Risk Analysis and Management, Georgia State University, Atlanta, GA, USA. obabalola4@student.gsu.edu</w:t>
+      </w:r>
+    </w:p>
+    <w:p>
+      <w:pPr>
+        <w:pStyle w:val="BodyText"/>
+      </w:pPr>
+      <w:r>
+        <w:rPr>
+          <w:b/>
+          <w:bCs/>
+        </w:rPr>
+        <w:t xml:space="preserve">Word count.</w:t>
+      </w:r>
+      <w:r>
+        <w:t xml:space="preserve"> </w:t>
+      </w:r>
+      <w:r>
+        <w:t xml:space="preserve">About 5,500 excluding abstract, tables and references.</w:t>
+      </w:r>
+      <w:r>
+        <w:t xml:space="preserve"> </w:t>
+      </w:r>
+      <w:r>
+        <w:rPr>
+          <w:b/>
+          <w:bCs/>
+        </w:rPr>
+        <w:t xml:space="preserve">Figures.</w:t>
+      </w:r>
+      <w:r>
+        <w:t xml:space="preserve"> </w:t>
+      </w:r>
+      <w:r>
+        <w:t xml:space="preserve">6.</w:t>
+      </w:r>
+      <w:r>
+        <w:t xml:space="preserve"> </w:t>
+      </w:r>
+      <w:r>
+        <w:rPr>
+          <w:b/>
+          <w:bCs/>
+        </w:rPr>
+        <w:t xml:space="preserve">Tables.</w:t>
+      </w:r>
+      <w:r>
+        <w:t xml:space="preserve"> </w:t>
+      </w:r>
+      <w:r>
+        <w:t xml:space="preserve">8 in text, 12 in appendix.</w:t>
       </w:r>
     </w:p>
     <w:p>

</xml_diff>

<commit_message>
Paper 2 final pass: 2019 out-of-pocket share, word count, table notes
</commit_message>
<xml_diff>
--- a/manuscript/Paper2_Babalola.docx
+++ b/manuscript/Paper2_Babalola.docx
@@ -96,7 +96,7 @@
         <w:t xml:space="preserve"> </w:t>
       </w:r>
       <w:r>
-        <w:t xml:space="preserve">5,457 excluding abstract, tables and references.</w:t>
+        <w:t xml:space="preserve">5,071 excluding abstract, tables and references.</w:t>
       </w:r>
     </w:p>
     <w:p>
@@ -227,7 +227,7 @@
         <w:pStyle w:val="FirstParagraph"/>
       </w:pPr>
       <w:r>
-        <w:t xml:space="preserve">Out-of-pocket payments financed 71.9% of Nigeria’s current health expenditure in 2023, among the highest shares recorded anywhere (WHO Global Health Expenditure Database). The National Health Insurance Authority (NHIA) Act 2022 was meant to change this: it makes health insurance mandatory, requires every state to run a scheme, obliges employers with five or more staff to enroll their workers, and creates a Vulnerable Group Fund to pay for those who cannot pay for themselves (Federal Republic of Nigeria 2022). Enrollment remains low and most Nigerian workers are informally employed. The survey analyzed here, fielded in 2018/19, describes the population the Act set out to cover.</w:t>
+        <w:t xml:space="preserve">Out-of-pocket payments financed 71.5% of Nigeria’s current health expenditure in 2019, among the highest shares recorded anywhere (WHO Global Health Expenditure Database). The National Health Insurance Authority (NHIA) Act 2022 was meant to change this: it makes health insurance mandatory, requires every state to run a scheme, obliges employers with five or more staff to enroll their workers, and creates a Vulnerable Group Fund to pay for those who cannot pay for themselves (Federal Republic of Nigeria 2022). Enrollment remains low and most Nigerian workers are informally employed. The survey analyzed here, fielded in 2018/19, describes the population the Act set out to cover.</w:t>
       </w:r>
     </w:p>
     <w:p>
@@ -423,7 +423,7 @@
         <w:t xml:space="preserve"> </w:t>
       </w:r>
       <w:r>
-        <w:t xml:space="preserve">Wave 4 has no health-insurance module, so coverage is not measured; the scheme counts published at the time put it in single digits. A wage worker is formal when the employer is a government body, or any other employer with five or more workers, the Act’s threshold; a household is informal if it contains no formal worker. On this rule 82.5% of households are informal (80.1% of the population). Three alternative rules are tested.</w:t>
+        <w:t xml:space="preserve">Wave 4 has no health-insurance module, so coverage is not measured. A wage worker is formal when the employer is a government body, or any other employer with five or more workers, the Act’s threshold; a household is informal if it contains no formal worker. On this rule 82.5% of households are informal (80.1% of the population). Three alternative rules are tested.</w:t>
       </w:r>
     </w:p>
     <w:p>
@@ -2020,7 +2020,7 @@
         </w:numPr>
       </w:pPr>
       <w:r>
-        <w:t xml:space="preserve">WHO Global Health Expenditure Database. Out-of-pocket expenditure as a share of current health expenditure, Nigeria, 2023 (World Bank indicator SH.XPD.OOPC.CH.ZS).</w:t>
+        <w:t xml:space="preserve">WHO Global Health Expenditure Database. Out-of-pocket expenditure as a share of current health expenditure, Nigeria, 2019 (World Bank indicator SH.XPD.OOPC.CH.ZS).</w:t>
       </w:r>
     </w:p>
     <w:p>
@@ -2096,7 +2096,7 @@
         <w:t xml:space="preserve">Generated from output/tables/</w:t>
       </w:r>
       <w:r>
-        <w:t xml:space="preserve">.csv by python/make_tables.py. All estimates are survey-weighted with Taylor-linearized standard errors for a stratified single-stage cluster design. Naira are in constant August 2023 prices. Consumption is the calibrated aggregate unless a row says otherwise.*</w:t>
+        <w:t xml:space="preserve">.csv by python/make_tables.py. All estimates are survey-weighted with Taylor-linearized standard errors for a stratified single-stage cluster design. Naira are in constant August 2023 prices. Consumption is the published wave-4 aggregate.*</w:t>
       </w:r>
     </w:p>
     <w:p>
@@ -12418,11 +12418,7 @@
           <w:p>
             <w:pPr>
               <w:pStyle w:val="Compact"/>
-              <w:jc w:val="right"/>
-            </w:pPr>
-            <w:r>
-              <w:t xml:space="preserve">None</w:t>
-            </w:r>
+            </w:pPr>
           </w:p>
         </w:tc>
         <w:tc>
@@ -12710,11 +12706,7 @@
           <w:p>
             <w:pPr>
               <w:pStyle w:val="Compact"/>
-              <w:jc w:val="right"/>
-            </w:pPr>
-            <w:r>
-              <w:t xml:space="preserve">None</w:t>
-            </w:r>
+            </w:pPr>
           </w:p>
         </w:tc>
         <w:tc>
@@ -18570,11 +18562,7 @@
           <w:p>
             <w:pPr>
               <w:pStyle w:val="Compact"/>
-              <w:jc w:val="right"/>
-            </w:pPr>
-            <w:r>
-              <w:t xml:space="preserve">nan</w:t>
-            </w:r>
+            </w:pPr>
           </w:p>
         </w:tc>
       </w:tr>
@@ -18681,11 +18669,7 @@
           <w:p>
             <w:pPr>
               <w:pStyle w:val="Compact"/>
-              <w:jc w:val="right"/>
-            </w:pPr>
-            <w:r>
-              <w:t xml:space="preserve">nan</w:t>
-            </w:r>
+            </w:pPr>
           </w:p>
         </w:tc>
       </w:tr>
@@ -18829,11 +18813,7 @@
           <w:p>
             <w:pPr>
               <w:pStyle w:val="Compact"/>
-              <w:jc w:val="right"/>
-            </w:pPr>
-            <w:r>
-              <w:t xml:space="preserve">nan</w:t>
-            </w:r>
+            </w:pPr>
           </w:p>
         </w:tc>
       </w:tr>

</xml_diff>